<commit_message>
docs(srs): nombres reales, fecha de entrega y generación reproducible
El documento salía con los marcadores de la plantilla en la portada y en
la tabla de personal involucrado. Quedan el autor —Cielo Medina—, el
docente evaluador —Adrian Lopez— y la fecha de entrega del 6 de septiembre
de 2026, que arrastra también el historial de revisiones y las firmas.

`docx` y `sharp` pasan a devDependencies y el script se invoca con
`npm run docs:srs`. Estaban instalados de paso y el script del repositorio
no corría en un clon limpio, que es justo lo que va a hacer quien reciba
esto. Ninguno de los dos llega al navegador: el presupuesto de size-limit
sigue en 623 kB de 650.

Co-Authored-By: Claude Opus 5 <noreply@anthropic.com>
</commit_message>
<xml_diff>
--- a/docs/srs/SRS-Sky-Import.docx
+++ b/docs/srs/SRS-Sky-Import.docx
@@ -310,7 +310,7 @@
                 <w:sz w:val="20"/>
                 <w:szCs w:val="20"/>
               </w:rPr>
-              <w:t xml:space="preserve">[COMPLETE CON SU NOMBRE Y APELLIDO]</w:t>
+              <w:t xml:space="preserve">Cielo Medina</w:t>
             </w:r>
           </w:p>
         </w:tc>
@@ -418,7 +418,7 @@
                 <w:sz w:val="20"/>
                 <w:szCs w:val="20"/>
               </w:rPr>
-              <w:t xml:space="preserve">31 de agosto de 2026</w:t>
+              <w:t xml:space="preserve">6 de septiembre de 2026</w:t>
             </w:r>
           </w:p>
         </w:tc>
@@ -472,7 +472,7 @@
                 <w:sz w:val="20"/>
                 <w:szCs w:val="20"/>
               </w:rPr>
-              <w:t xml:space="preserve">[COMPLETE CON EL NOMBRE DEL DOCENTE]</w:t>
+              <w:t xml:space="preserve">Adrian Lopez</w:t>
             </w:r>
           </w:p>
         </w:tc>
@@ -1026,7 +1026,7 @@
                 <w:sz w:val="20"/>
                 <w:szCs w:val="20"/>
               </w:rPr>
-              <w:t xml:space="preserve">31/08/2026</w:t>
+              <w:t xml:space="preserve">06/09/2026</w:t>
             </w:r>
           </w:p>
         </w:tc>
@@ -1302,7 +1302,7 @@
                 <w:sz w:val="20"/>
                 <w:szCs w:val="20"/>
               </w:rPr>
-              <w:t xml:space="preserve">31/08/2026</w:t>
+              <w:t xml:space="preserve">06/09/2026</w:t>
             </w:r>
           </w:p>
         </w:tc>
@@ -1382,7 +1382,7 @@
                 <w:sz w:val="20"/>
                 <w:szCs w:val="20"/>
               </w:rPr>
-              <w:t xml:space="preserve">31/08/2026</w:t>
+              <w:t xml:space="preserve">06/09/2026</w:t>
             </w:r>
           </w:p>
         </w:tc>
@@ -1462,7 +1462,7 @@
                 <w:sz w:val="20"/>
                 <w:szCs w:val="20"/>
               </w:rPr>
-              <w:t xml:space="preserve">31/08/2026</w:t>
+              <w:t xml:space="preserve">06/09/2026</w:t>
             </w:r>
           </w:p>
         </w:tc>
@@ -2354,7 +2354,7 @@
                 <w:sz w:val="20"/>
                 <w:szCs w:val="20"/>
               </w:rPr>
-              <w:t xml:space="preserve">[COMPLETE SU NOMBRE]</w:t>
+              <w:t xml:space="preserve">Cielo Medina</w:t>
             </w:r>
           </w:p>
         </w:tc>
@@ -2432,7 +2432,7 @@
                 <w:sz w:val="20"/>
                 <w:szCs w:val="20"/>
               </w:rPr>
-              <w:t xml:space="preserve">[Correo electrónico]</w:t>
+              <w:t xml:space="preserve">ciendel.dev@gmail.com</w:t>
             </w:r>
           </w:p>
         </w:tc>
@@ -2460,7 +2460,7 @@
                 <w:sz w:val="20"/>
                 <w:szCs w:val="20"/>
               </w:rPr>
-              <w:t xml:space="preserve">[NOMBRE DEL DOCENTE]</w:t>
+              <w:t xml:space="preserve">Adrian Lopez</w:t>
             </w:r>
           </w:p>
         </w:tc>
@@ -2538,7 +2538,7 @@
                 <w:sz w:val="20"/>
                 <w:szCs w:val="20"/>
               </w:rPr>
-              <w:t xml:space="preserve">[Correo electrónico]</w:t>
+              <w:t xml:space="preserve">Cátedra Taller de Lenguaje 135</w:t>
             </w:r>
           </w:p>
         </w:tc>

</xml_diff>

<commit_message>
docs(srs): especificar el restablecimiento de contraseña ajena
Comparé las acciones de servidor que existen en el código contra los requisitos
declarados y apareció un hueco: `resetPanelPassword` solo figuraba de pasada,
dentro de la descripción del alta de cuentas, sin precondiciones ni condiciones
de salida propias.

No es un detalle menor de redacción. Es la operación que decide quién puede
apoderarse de la cuenta de otro, y sus límites —no exige la contraseña vigente,
por lo que queda acotada a cuentas de perfil administrador y nunca a la propia
ni a la de otro moderador— no estaban escritos en ninguna parte del documento.
Un requisito que no enuncia sus límites no se puede verificar.

Queda como RF21.

Co-Authored-By: Claude Opus 5 <noreply@anthropic.com>
</commit_message>
<xml_diff>
--- a/docs/srs/SRS-Sky-Import.docx
+++ b/docs/srs/SRS-Sky-Import.docx
@@ -16120,6 +16120,537 @@
       </w:pPr>
     </w:p>
     <w:p>
+      <w:pPr>
+        <w:pStyle w:val="Heading3"/>
+        <w:spacing w:after="120" w:before="260"/>
+      </w:pPr>
+      <w:r>
+        <w:t xml:space="preserve">RF21: Restablecimiento de la contraseña de otra cuenta</w:t>
+      </w:r>
+    </w:p>
+    <w:tbl>
+      <w:tblPr>
+        <w:tblW w:type="dxa" w:w="9026"/>
+        <w:tblBorders>
+          <w:top w:val="single" w:color="auto" w:sz="4"/>
+          <w:left w:val="single" w:color="auto" w:sz="4"/>
+          <w:bottom w:val="single" w:color="auto" w:sz="4"/>
+          <w:right w:val="single" w:color="auto" w:sz="4"/>
+          <w:insideH w:val="single" w:color="auto" w:sz="4"/>
+          <w:insideV w:val="single" w:color="auto" w:sz="4"/>
+        </w:tblBorders>
+      </w:tblPr>
+      <w:tblGrid>
+        <w:gridCol w:w="2500"/>
+        <w:gridCol w:w="6526"/>
+      </w:tblGrid>
+      <w:tr>
+        <w:tc>
+          <w:tcPr>
+            <w:tcW w:type="dxa" w:w="2500"/>
+            <w:shd w:fill="F2F4F7" w:val="clear"/>
+            <w:tcMar>
+              <w:top w:type="dxa" w:w="80"/>
+              <w:left w:type="dxa" w:w="110"/>
+              <w:bottom w:type="dxa" w:w="80"/>
+              <w:right w:type="dxa" w:w="110"/>
+            </w:tcMar>
+          </w:tcPr>
+          <w:p>
+            <w:pPr>
+              <w:spacing w:after="40" w:line="260"/>
+            </w:pPr>
+            <w:r>
+              <w:rPr>
+                <w:b/>
+                <w:bCs/>
+                <w:color w:val="1F3864"/>
+                <w:sz w:val="20"/>
+                <w:szCs w:val="20"/>
+              </w:rPr>
+              <w:t xml:space="preserve">Identificador del Requisito</w:t>
+            </w:r>
+          </w:p>
+        </w:tc>
+        <w:tc>
+          <w:tcPr>
+            <w:tcW w:type="dxa" w:w="6526"/>
+            <w:tcMar>
+              <w:top w:type="dxa" w:w="80"/>
+              <w:left w:type="dxa" w:w="110"/>
+              <w:bottom w:type="dxa" w:w="80"/>
+              <w:right w:type="dxa" w:w="110"/>
+            </w:tcMar>
+          </w:tcPr>
+          <w:p>
+            <w:pPr>
+              <w:spacing w:after="40" w:line="260"/>
+            </w:pPr>
+            <w:r>
+              <w:rPr>
+                <w:b w:val="false"/>
+                <w:bCs w:val="false"/>
+                <w:color w:val="1A232C"/>
+                <w:sz w:val="20"/>
+                <w:szCs w:val="20"/>
+              </w:rPr>
+              <w:t xml:space="preserve">RF21</w:t>
+            </w:r>
+          </w:p>
+        </w:tc>
+      </w:tr>
+      <w:tr>
+        <w:tc>
+          <w:tcPr>
+            <w:tcW w:type="dxa" w:w="2500"/>
+            <w:shd w:fill="F2F4F7" w:val="clear"/>
+            <w:tcMar>
+              <w:top w:type="dxa" w:w="80"/>
+              <w:left w:type="dxa" w:w="110"/>
+              <w:bottom w:type="dxa" w:w="80"/>
+              <w:right w:type="dxa" w:w="110"/>
+            </w:tcMar>
+          </w:tcPr>
+          <w:p>
+            <w:pPr>
+              <w:spacing w:after="40" w:line="260"/>
+            </w:pPr>
+            <w:r>
+              <w:rPr>
+                <w:b/>
+                <w:bCs/>
+                <w:color w:val="1F3864"/>
+                <w:sz w:val="20"/>
+                <w:szCs w:val="20"/>
+              </w:rPr>
+              <w:t xml:space="preserve">Nombre del Requisito</w:t>
+            </w:r>
+          </w:p>
+        </w:tc>
+        <w:tc>
+          <w:tcPr>
+            <w:tcW w:type="dxa" w:w="6526"/>
+            <w:tcMar>
+              <w:top w:type="dxa" w:w="80"/>
+              <w:left w:type="dxa" w:w="110"/>
+              <w:bottom w:type="dxa" w:w="80"/>
+              <w:right w:type="dxa" w:w="110"/>
+            </w:tcMar>
+          </w:tcPr>
+          <w:p>
+            <w:pPr>
+              <w:spacing w:after="40" w:line="260"/>
+            </w:pPr>
+            <w:r>
+              <w:rPr>
+                <w:b w:val="false"/>
+                <w:bCs w:val="false"/>
+                <w:color w:val="1A232C"/>
+                <w:sz w:val="20"/>
+                <w:szCs w:val="20"/>
+              </w:rPr>
+              <w:t xml:space="preserve">Restablecimiento de la contraseña de otra cuenta</w:t>
+            </w:r>
+          </w:p>
+        </w:tc>
+      </w:tr>
+      <w:tr>
+        <w:tc>
+          <w:tcPr>
+            <w:tcW w:type="dxa" w:w="2500"/>
+            <w:shd w:fill="F2F4F7" w:val="clear"/>
+            <w:tcMar>
+              <w:top w:type="dxa" w:w="80"/>
+              <w:left w:type="dxa" w:w="110"/>
+              <w:bottom w:type="dxa" w:w="80"/>
+              <w:right w:type="dxa" w:w="110"/>
+            </w:tcMar>
+          </w:tcPr>
+          <w:p>
+            <w:pPr>
+              <w:spacing w:after="40" w:line="260"/>
+            </w:pPr>
+            <w:r>
+              <w:rPr>
+                <w:b/>
+                <w:bCs/>
+                <w:color w:val="1F3864"/>
+                <w:sz w:val="20"/>
+                <w:szCs w:val="20"/>
+              </w:rPr>
+              <w:t xml:space="preserve">Sintaxis Formal (ISO 29148)</w:t>
+            </w:r>
+          </w:p>
+        </w:tc>
+        <w:tc>
+          <w:tcPr>
+            <w:tcW w:type="dxa" w:w="6526"/>
+            <w:tcMar>
+              <w:top w:type="dxa" w:w="80"/>
+              <w:left w:type="dxa" w:w="110"/>
+              <w:bottom w:type="dxa" w:w="80"/>
+              <w:right w:type="dxa" w:w="110"/>
+            </w:tcMar>
+          </w:tcPr>
+          <w:p>
+            <w:pPr>
+              <w:spacing w:after="40" w:line="260"/>
+            </w:pPr>
+            <w:r>
+              <w:rPr>
+                <w:b w:val="false"/>
+                <w:bCs w:val="false"/>
+                <w:color w:val="1A232C"/>
+                <w:sz w:val="20"/>
+                <w:szCs w:val="20"/>
+              </w:rPr>
+              <w:t xml:space="preserve">Cuando un administrador pierda el acceso [Condición], el moderador [Sujeto] deberá poder asignarle [Acción] una contraseña nueva desde el panel [Objeto], sin conocer la anterior y sin poder aplicarlo sobre otro moderador [Restricción].</w:t>
+            </w:r>
+          </w:p>
+        </w:tc>
+      </w:tr>
+      <w:tr>
+        <w:tc>
+          <w:tcPr>
+            <w:tcW w:type="dxa" w:w="2500"/>
+            <w:shd w:fill="F2F4F7" w:val="clear"/>
+            <w:tcMar>
+              <w:top w:type="dxa" w:w="80"/>
+              <w:left w:type="dxa" w:w="110"/>
+              <w:bottom w:type="dxa" w:w="80"/>
+              <w:right w:type="dxa" w:w="110"/>
+            </w:tcMar>
+          </w:tcPr>
+          <w:p>
+            <w:pPr>
+              <w:spacing w:after="40" w:line="260"/>
+            </w:pPr>
+            <w:r>
+              <w:rPr>
+                <w:b/>
+                <w:bCs/>
+                <w:color w:val="1F3864"/>
+                <w:sz w:val="20"/>
+                <w:szCs w:val="20"/>
+              </w:rPr>
+              <w:t xml:space="preserve">Descripción del Requisito</w:t>
+            </w:r>
+          </w:p>
+        </w:tc>
+        <w:tc>
+          <w:tcPr>
+            <w:tcW w:type="dxa" w:w="6526"/>
+            <w:tcMar>
+              <w:top w:type="dxa" w:w="80"/>
+              <w:left w:type="dxa" w:w="110"/>
+              <w:bottom w:type="dxa" w:w="80"/>
+              <w:right w:type="dxa" w:w="110"/>
+            </w:tcMar>
+          </w:tcPr>
+          <w:p>
+            <w:pPr>
+              <w:spacing w:after="40" w:line="260"/>
+            </w:pPr>
+            <w:r>
+              <w:rPr>
+                <w:b w:val="false"/>
+                <w:bCs w:val="false"/>
+                <w:color w:val="1A232C"/>
+                <w:sz w:val="20"/>
+                <w:szCs w:val="20"/>
+              </w:rPr>
+              <w:t xml:space="preserve">Recupera el acceso de un colaborador sin recurrir a correo electrónico ni a la consola del proveedor: las cuentas del panel emplean un correo interno determinista que nadie consulta. La operación no exige la contraseña vigente —el moderador no la conoce ni debe conocerla—, por lo que queda acotada a cuentas de perfil administrador: ni la propia ni la de otro moderador pueden restablecerse por esta vía, de modo que nadie se apodera de una cuenta de igual jerarquía. La pantalla de acceso remite explícitamente a este procedimiento cuando alguien pierde su contraseña.</w:t>
+            </w:r>
+          </w:p>
+        </w:tc>
+      </w:tr>
+      <w:tr>
+        <w:tc>
+          <w:tcPr>
+            <w:tcW w:type="dxa" w:w="2500"/>
+            <w:shd w:fill="F2F4F7" w:val="clear"/>
+            <w:tcMar>
+              <w:top w:type="dxa" w:w="80"/>
+              <w:left w:type="dxa" w:w="110"/>
+              <w:bottom w:type="dxa" w:w="80"/>
+              <w:right w:type="dxa" w:w="110"/>
+            </w:tcMar>
+          </w:tcPr>
+          <w:p>
+            <w:pPr>
+              <w:spacing w:after="40" w:line="260"/>
+            </w:pPr>
+            <w:r>
+              <w:rPr>
+                <w:b/>
+                <w:bCs/>
+                <w:color w:val="1F3864"/>
+                <w:sz w:val="20"/>
+                <w:szCs w:val="20"/>
+              </w:rPr>
+              <w:t xml:space="preserve">Condiciones de Entrada (Precondiciones)</w:t>
+            </w:r>
+          </w:p>
+        </w:tc>
+        <w:tc>
+          <w:tcPr>
+            <w:tcW w:type="dxa" w:w="6526"/>
+            <w:tcMar>
+              <w:top w:type="dxa" w:w="80"/>
+              <w:left w:type="dxa" w:w="110"/>
+              <w:bottom w:type="dxa" w:w="80"/>
+              <w:right w:type="dxa" w:w="110"/>
+            </w:tcMar>
+          </w:tcPr>
+          <w:p>
+            <w:pPr>
+              <w:spacing w:after="40" w:line="260"/>
+            </w:pPr>
+            <w:r>
+              <w:rPr>
+                <w:b w:val="false"/>
+                <w:bCs w:val="false"/>
+                <w:color w:val="1A232C"/>
+                <w:sz w:val="20"/>
+                <w:szCs w:val="20"/>
+              </w:rPr>
+              <w:t xml:space="preserve">1. Existe una sesión activa cuyo rol verificado es el de moderador.</w:t>
+            </w:r>
+          </w:p>
+          <w:p>
+            <w:pPr>
+              <w:spacing w:after="40" w:line="260"/>
+            </w:pPr>
+            <w:r>
+              <w:rPr>
+                <w:b w:val="false"/>
+                <w:bCs w:val="false"/>
+                <w:color w:val="1A232C"/>
+                <w:sz w:val="20"/>
+                <w:szCs w:val="20"/>
+              </w:rPr>
+              <w:t xml:space="preserve">2. La cuenta afectada pertenece al panel, es distinta de la propia y su perfil es el de administrador.</w:t>
+            </w:r>
+          </w:p>
+          <w:p>
+            <w:pPr>
+              <w:spacing w:after="40" w:line="260"/>
+            </w:pPr>
+            <w:r>
+              <w:rPr>
+                <w:b w:val="false"/>
+                <w:bCs w:val="false"/>
+                <w:color w:val="1A232C"/>
+                <w:sz w:val="20"/>
+                <w:szCs w:val="20"/>
+              </w:rPr>
+              <w:t xml:space="preserve">3. La contraseña nueva tiene entre doce y ciento veintiocho caracteres y coincide con su repetición.</w:t>
+            </w:r>
+          </w:p>
+        </w:tc>
+      </w:tr>
+      <w:tr>
+        <w:tc>
+          <w:tcPr>
+            <w:tcW w:type="dxa" w:w="2500"/>
+            <w:shd w:fill="F2F4F7" w:val="clear"/>
+            <w:tcMar>
+              <w:top w:type="dxa" w:w="80"/>
+              <w:left w:type="dxa" w:w="110"/>
+              <w:bottom w:type="dxa" w:w="80"/>
+              <w:right w:type="dxa" w:w="110"/>
+            </w:tcMar>
+          </w:tcPr>
+          <w:p>
+            <w:pPr>
+              <w:spacing w:after="40" w:line="260"/>
+            </w:pPr>
+            <w:r>
+              <w:rPr>
+                <w:b/>
+                <w:bCs/>
+                <w:color w:val="1F3864"/>
+                <w:sz w:val="20"/>
+                <w:szCs w:val="20"/>
+              </w:rPr>
+              <w:t xml:space="preserve">Especificación de Condiciones de Salida (Postcondiciones SQL)</w:t>
+            </w:r>
+          </w:p>
+        </w:tc>
+        <w:tc>
+          <w:tcPr>
+            <w:tcW w:type="dxa" w:w="6526"/>
+            <w:tcMar>
+              <w:top w:type="dxa" w:w="80"/>
+              <w:left w:type="dxa" w:w="110"/>
+              <w:bottom w:type="dxa" w:w="80"/>
+              <w:right w:type="dxa" w:w="110"/>
+            </w:tcMar>
+          </w:tcPr>
+          <w:p>
+            <w:pPr>
+              <w:spacing w:after="40" w:line="260"/>
+            </w:pPr>
+            <w:r>
+              <w:rPr>
+                <w:b w:val="false"/>
+                <w:bCs w:val="false"/>
+                <w:color w:val="1A232C"/>
+                <w:sz w:val="20"/>
+                <w:szCs w:val="20"/>
+              </w:rPr>
+              <w:t xml:space="preserve">1. Actualización de la credencial en el servicio de autenticación, mediante la clave de servicio.</w:t>
+            </w:r>
+          </w:p>
+          <w:p>
+            <w:pPr>
+              <w:spacing w:after="40" w:line="260"/>
+            </w:pPr>
+            <w:r>
+              <w:rPr>
+                <w:b w:val="false"/>
+                <w:bCs w:val="false"/>
+                <w:color w:val="1A232C"/>
+                <w:sz w:val="20"/>
+                <w:szCs w:val="20"/>
+              </w:rPr>
+              <w:t xml:space="preserve">2. La contraseña anterior deja de habilitar el ingreso.</w:t>
+            </w:r>
+          </w:p>
+          <w:p>
+            <w:pPr>
+              <w:spacing w:after="40" w:line="260"/>
+            </w:pPr>
+            <w:r>
+              <w:rPr>
+                <w:b w:val="false"/>
+                <w:bCs w:val="false"/>
+                <w:color w:val="1A232C"/>
+                <w:sz w:val="20"/>
+                <w:szCs w:val="20"/>
+              </w:rPr>
+              <w:t xml:space="preserve">3. No se modifica la pertenencia al panel ni el estado de acceso de la cuenta.</w:t>
+            </w:r>
+          </w:p>
+        </w:tc>
+      </w:tr>
+      <w:tr>
+        <w:tc>
+          <w:tcPr>
+            <w:tcW w:type="dxa" w:w="2500"/>
+            <w:shd w:fill="F2F4F7" w:val="clear"/>
+            <w:tcMar>
+              <w:top w:type="dxa" w:w="80"/>
+              <w:left w:type="dxa" w:w="110"/>
+              <w:bottom w:type="dxa" w:w="80"/>
+              <w:right w:type="dxa" w:w="110"/>
+            </w:tcMar>
+          </w:tcPr>
+          <w:p>
+            <w:pPr>
+              <w:spacing w:after="40" w:line="260"/>
+            </w:pPr>
+            <w:r>
+              <w:rPr>
+                <w:b/>
+                <w:bCs/>
+                <w:color w:val="1F3864"/>
+                <w:sz w:val="20"/>
+                <w:szCs w:val="20"/>
+              </w:rPr>
+              <w:t xml:space="preserve">Requisitos No Funcionales relacionados</w:t>
+            </w:r>
+          </w:p>
+        </w:tc>
+        <w:tc>
+          <w:tcPr>
+            <w:tcW w:type="dxa" w:w="6526"/>
+            <w:tcMar>
+              <w:top w:type="dxa" w:w="80"/>
+              <w:left w:type="dxa" w:w="110"/>
+              <w:bottom w:type="dxa" w:w="80"/>
+              <w:right w:type="dxa" w:w="110"/>
+            </w:tcMar>
+          </w:tcPr>
+          <w:p>
+            <w:pPr>
+              <w:spacing w:after="40" w:line="260"/>
+            </w:pPr>
+            <w:r>
+              <w:rPr>
+                <w:b w:val="false"/>
+                <w:bCs w:val="false"/>
+                <w:color w:val="1A232C"/>
+                <w:sz w:val="20"/>
+                <w:szCs w:val="20"/>
+              </w:rPr>
+              <w:t xml:space="preserve">RNF02 (Control de acceso), RNF14 (Privacidad), RNF15 (Separación de funciones)</w:t>
+            </w:r>
+          </w:p>
+        </w:tc>
+      </w:tr>
+      <w:tr>
+        <w:tc>
+          <w:tcPr>
+            <w:tcW w:type="dxa" w:w="2500"/>
+            <w:shd w:fill="F2F4F7" w:val="clear"/>
+            <w:tcMar>
+              <w:top w:type="dxa" w:w="80"/>
+              <w:left w:type="dxa" w:w="110"/>
+              <w:bottom w:type="dxa" w:w="80"/>
+              <w:right w:type="dxa" w:w="110"/>
+            </w:tcMar>
+          </w:tcPr>
+          <w:p>
+            <w:pPr>
+              <w:spacing w:after="40" w:line="260"/>
+            </w:pPr>
+            <w:r>
+              <w:rPr>
+                <w:b/>
+                <w:bCs/>
+                <w:color w:val="1F3864"/>
+                <w:sz w:val="20"/>
+                <w:szCs w:val="20"/>
+              </w:rPr>
+              <w:t xml:space="preserve">Prioridad / Criterio de Aceptación</w:t>
+            </w:r>
+          </w:p>
+        </w:tc>
+        <w:tc>
+          <w:tcPr>
+            <w:tcW w:type="dxa" w:w="6526"/>
+            <w:tcMar>
+              <w:top w:type="dxa" w:w="80"/>
+              <w:left w:type="dxa" w:w="110"/>
+              <w:bottom w:type="dxa" w:w="80"/>
+              <w:right w:type="dxa" w:w="110"/>
+            </w:tcMar>
+          </w:tcPr>
+          <w:p>
+            <w:pPr>
+              <w:spacing w:after="40" w:line="260"/>
+            </w:pPr>
+            <w:r>
+              <w:rPr>
+                <w:b w:val="false"/>
+                <w:bCs w:val="false"/>
+                <w:color w:val="1A232C"/>
+                <w:sz w:val="20"/>
+                <w:szCs w:val="20"/>
+              </w:rPr>
+              <w:t xml:space="preserve">Media-Alta. Caso de prueba verificado: tras el restablecimiento, la contraseña anterior es rechazada y la nueva es aceptada. Un intento sobre una cuenta de perfil moderador se deniega sin efectuar cambio alguno.</w:t>
+            </w:r>
+          </w:p>
+        </w:tc>
+      </w:tr>
+    </w:tbl>
+    <w:p>
+      <w:pPr>
+        <w:spacing w:after="120"/>
+      </w:pPr>
+    </w:p>
+    <w:p>
       <w:r>
         <w:br w:type="page"/>
       </w:r>

</xml_diff>